<commit_message>
Spellcheck performed on documentation
</commit_message>
<xml_diff>
--- a/Docs/224327_Front-End Web Development_Aliakber Alibhai.docx
+++ b/Docs/224327_Front-End Web Development_Aliakber Alibhai.docx
@@ -9,6 +9,7 @@
           <w:rFonts w:eastAsiaTheme="minorHAnsi"/>
           <w:b/>
           <w:kern w:val="2"/>
+          <w:lang w:val="en-GB"/>
           <w14:ligatures w14:val="standardContextual"/>
         </w:rPr>
         <w:id w:val="2033076234"/>
@@ -34,6 +35,7 @@
             <w:pStyle w:val="arial14ptbold"/>
             <w:rPr>
               <w:rStyle w:val="arial14ptboldChar"/>
+              <w:lang w:val="en-GB"/>
             </w:rPr>
           </w:pPr>
         </w:p>
@@ -42,6 +44,7 @@
             <w:pStyle w:val="arial14ptbold"/>
             <w:rPr>
               <w:rStyle w:val="arial14ptboldChar"/>
+              <w:lang w:val="en-GB"/>
             </w:rPr>
           </w:pPr>
         </w:p>
@@ -83,25 +86,7 @@
                     <w:sz w:val="24"/>
                     <w:szCs w:val="24"/>
                   </w:rPr>
-                  <w:t>A signed copy of this form must be submitted with every</w:t>
-                </w:r>
-                <w:r>
-                  <w:rPr>
-                    <w:b/>
-                    <w:i/>
-                    <w:sz w:val="24"/>
-                    <w:szCs w:val="24"/>
-                  </w:rPr>
-                  <w:t xml:space="preserve"> </w:t>
-                </w:r>
-                <w:r>
-                  <w:rPr>
-                    <w:b/>
-                    <w:i/>
-                    <w:sz w:val="24"/>
-                    <w:szCs w:val="24"/>
-                  </w:rPr>
-                  <w:t>assignment.</w:t>
+                  <w:t>A signed copy of this form must be submitted with every assignment.</w:t>
                 </w:r>
               </w:p>
               <w:p>
@@ -122,34 +107,7 @@
                     <w:sz w:val="24"/>
                     <w:szCs w:val="24"/>
                   </w:rPr>
-                  <w:t xml:space="preserve">If the statement is missing your work </w:t>
-                </w:r>
-                <w:r>
-                  <w:rPr>
-                    <w:b/>
-                    <w:i/>
-                    <w:sz w:val="24"/>
-                    <w:szCs w:val="24"/>
-                  </w:rPr>
-                  <w:t>may</w:t>
-                </w:r>
-                <w:r>
-                  <w:rPr>
-                    <w:b/>
-                    <w:i/>
-                    <w:sz w:val="24"/>
-                    <w:szCs w:val="24"/>
-                  </w:rPr>
-                  <w:t xml:space="preserve"> not be marked.</w:t>
-                </w:r>
-                <w:r>
-                  <w:rPr>
-                    <w:b/>
-                    <w:i/>
-                    <w:sz w:val="24"/>
-                    <w:szCs w:val="24"/>
-                  </w:rPr>
-                  <w:t xml:space="preserve"> </w:t>
+                  <w:t xml:space="preserve">If the statement is missing your work may not be marked. </w:t>
                 </w:r>
               </w:p>
               <w:p>
@@ -184,6 +142,7 @@
                     <w:i/>
                     <w:sz w:val="24"/>
                     <w:szCs w:val="24"/>
+                    <w:lang w:val="en-GB"/>
                   </w:rPr>
                 </w:pPr>
                 <w:r>
@@ -215,6 +174,7 @@
             <w:rPr>
               <w:rStyle w:val="arial14ptboldChar"/>
               <w:u w:val="single"/>
+              <w:lang w:val="en-GB"/>
             </w:rPr>
           </w:pPr>
           <w:r>
@@ -239,6 +199,7 @@
             <w:pStyle w:val="arial14ptbold"/>
             <w:rPr>
               <w:rStyle w:val="arial14ptboldChar"/>
+              <w:lang w:val="en-GB"/>
             </w:rPr>
           </w:pPr>
           <w:r>
@@ -255,6 +216,7 @@
             <w:pStyle w:val="arial14ptbold"/>
             <w:rPr>
               <w:rStyle w:val="arial14ptboldChar"/>
+              <w:lang w:val="en-GB"/>
             </w:rPr>
           </w:pPr>
         </w:p>
@@ -291,6 +253,7 @@
                     <w:bCs w:val="0"/>
                     <w:sz w:val="24"/>
                     <w:szCs w:val="24"/>
+                    <w:lang w:val="en-GB"/>
                   </w:rPr>
                 </w:pPr>
                 <w:r>
@@ -301,6 +264,7 @@
                     <w:bCs w:val="0"/>
                     <w:sz w:val="24"/>
                     <w:szCs w:val="24"/>
+                    <w:lang w:val="en-GB"/>
                   </w:rPr>
                   <w:t>Candidate Name:</w:t>
                 </w:r>
@@ -319,6 +283,7 @@
                     <w:rFonts w:eastAsiaTheme="majorEastAsia"/>
                     <w:sz w:val="24"/>
                     <w:szCs w:val="24"/>
+                    <w:lang w:val="en-GB"/>
                   </w:rPr>
                 </w:pPr>
                 <w:r>
@@ -350,6 +315,7 @@
                     <w:bCs w:val="0"/>
                     <w:sz w:val="24"/>
                     <w:szCs w:val="24"/>
+                    <w:lang w:val="en-GB"/>
                   </w:rPr>
                 </w:pPr>
                 <w:r>
@@ -360,6 +326,7 @@
                     <w:bCs w:val="0"/>
                     <w:sz w:val="24"/>
                     <w:szCs w:val="24"/>
+                    <w:lang w:val="en-GB"/>
                   </w:rPr>
                   <w:t>Candidate ID Number:</w:t>
                 </w:r>
@@ -378,6 +345,7 @@
                     <w:rFonts w:eastAsiaTheme="majorEastAsia"/>
                     <w:sz w:val="24"/>
                     <w:szCs w:val="24"/>
+                    <w:lang w:val="en-GB"/>
                   </w:rPr>
                 </w:pPr>
                 <w:r>
@@ -386,6 +354,7 @@
                     <w:rFonts w:eastAsiaTheme="majorEastAsia"/>
                     <w:sz w:val="24"/>
                     <w:szCs w:val="24"/>
+                    <w:lang w:val="en-GB"/>
                   </w:rPr>
                   <w:t xml:space="preserve"> </w:t>
                 </w:r>
@@ -418,6 +387,7 @@
                     <w:bCs w:val="0"/>
                     <w:sz w:val="24"/>
                     <w:szCs w:val="24"/>
+                    <w:lang w:val="en-GB"/>
                   </w:rPr>
                 </w:pPr>
                 <w:r>
@@ -428,6 +398,7 @@
                     <w:bCs w:val="0"/>
                     <w:sz w:val="24"/>
                     <w:szCs w:val="24"/>
+                    <w:lang w:val="en-GB"/>
                   </w:rPr>
                   <w:t>Qualification:</w:t>
                 </w:r>
@@ -455,7 +426,6 @@
                   <w:rPr>
                     <w:rFonts w:ascii="Calibri" w:eastAsia="Times New Roman" w:hAnsi="Calibri" w:cs="Times New Roman"/>
                     <w:color w:val="2F5496"/>
-                    <w:lang w:val="en-GB"/>
                   </w:rPr>
                   <w:t>Level 4 Diploma in Computing (L4DC)</w:t>
                 </w:r>
@@ -480,6 +450,7 @@
                     <w:bCs w:val="0"/>
                     <w:sz w:val="24"/>
                     <w:szCs w:val="24"/>
+                    <w:lang w:val="en-GB"/>
                   </w:rPr>
                 </w:pPr>
                 <w:r>
@@ -490,6 +461,7 @@
                     <w:bCs w:val="0"/>
                     <w:sz w:val="24"/>
                     <w:szCs w:val="24"/>
+                    <w:lang w:val="en-GB"/>
                   </w:rPr>
                   <w:t>Unit:</w:t>
                 </w:r>
@@ -508,6 +480,7 @@
                     <w:rFonts w:eastAsiaTheme="majorEastAsia"/>
                     <w:sz w:val="24"/>
                     <w:szCs w:val="24"/>
+                    <w:lang w:val="en-GB"/>
                   </w:rPr>
                 </w:pPr>
                 <w:r>
@@ -516,6 +489,7 @@
                     <w:rFonts w:eastAsiaTheme="majorEastAsia"/>
                     <w:sz w:val="24"/>
                     <w:szCs w:val="24"/>
+                    <w:lang w:val="en-GB"/>
                   </w:rPr>
                   <w:t>Front-End Web Development</w:t>
                 </w:r>
@@ -538,6 +512,7 @@
                     <w:bCs w:val="0"/>
                     <w:sz w:val="24"/>
                     <w:szCs w:val="24"/>
+                    <w:lang w:val="en-GB"/>
                   </w:rPr>
                 </w:pPr>
                 <w:r>
@@ -548,6 +523,7 @@
                     <w:bCs w:val="0"/>
                     <w:sz w:val="24"/>
                     <w:szCs w:val="24"/>
+                    <w:lang w:val="en-GB"/>
                   </w:rPr>
                   <w:t>Centre:</w:t>
                 </w:r>
@@ -566,6 +542,7 @@
                     <w:rFonts w:eastAsiaTheme="majorEastAsia"/>
                     <w:sz w:val="24"/>
                     <w:szCs w:val="24"/>
+                    <w:lang w:val="en-GB"/>
                   </w:rPr>
                 </w:pPr>
                 <w:r>
@@ -597,6 +574,7 @@
                     <w:bCs w:val="0"/>
                     <w:sz w:val="24"/>
                     <w:szCs w:val="24"/>
+                    <w:lang w:val="en-GB"/>
                   </w:rPr>
                 </w:pPr>
                 <w:r>
@@ -607,6 +585,7 @@
                     <w:bCs w:val="0"/>
                     <w:sz w:val="24"/>
                     <w:szCs w:val="24"/>
+                    <w:lang w:val="en-GB"/>
                   </w:rPr>
                   <w:t>Word Count:</w:t>
                 </w:r>
@@ -625,6 +604,7 @@
                     <w:rFonts w:eastAsiaTheme="majorEastAsia"/>
                     <w:sz w:val="24"/>
                     <w:szCs w:val="24"/>
+                    <w:lang w:val="en-GB"/>
                   </w:rPr>
                 </w:pPr>
                 <w:r>
@@ -633,6 +613,7 @@
                     <w:rFonts w:eastAsiaTheme="majorEastAsia"/>
                     <w:sz w:val="24"/>
                     <w:szCs w:val="24"/>
+                    <w:lang w:val="en-GB"/>
                   </w:rPr>
                   <w:t>1329 words (incl. table of contents)</w:t>
                 </w:r>
@@ -692,15 +673,7 @@
                     <w:sz w:val="24"/>
                     <w:szCs w:val="24"/>
                   </w:rPr>
-                  <w:t xml:space="preserve">I confirm </w:t>
-                </w:r>
-                <w:r>
-                  <w:rPr>
-                    <w:b w:val="0"/>
-                    <w:sz w:val="24"/>
-                    <w:szCs w:val="24"/>
-                  </w:rPr>
-                  <w:t>that I have not exceeded the stipulated word limit by more than 10%.</w:t>
+                  <w:t>I confirm that I have not exceeded the stipulated word limit by more than 10%.</w:t>
                 </w:r>
               </w:p>
               <w:p>
@@ -710,6 +683,7 @@
                   <w:rPr>
                     <w:rStyle w:val="arial14ptboldChar"/>
                     <w:rFonts w:eastAsiaTheme="majorEastAsia"/>
+                    <w:lang w:val="en-GB"/>
                   </w:rPr>
                 </w:pPr>
                 <w:r>
@@ -718,15 +692,7 @@
                     <w:sz w:val="24"/>
                     <w:szCs w:val="24"/>
                   </w:rPr>
-                  <w:t xml:space="preserve">I confirm </w:t>
-                </w:r>
-                <w:r>
-                  <w:rPr>
-                    <w:b w:val="0"/>
-                    <w:sz w:val="24"/>
-                    <w:szCs w:val="24"/>
-                  </w:rPr>
-                  <w:t>that this is my own work and that I have not colluded or plagiarised any part of it.</w:t>
+                  <w:t>I confirm that this is my own work and that I have not colluded or plagiarised any part of it.</w:t>
                 </w:r>
               </w:p>
             </w:tc>
@@ -747,6 +713,7 @@
                     <w:bCs w:val="0"/>
                     <w:sz w:val="24"/>
                     <w:szCs w:val="24"/>
+                    <w:lang w:val="en-GB"/>
                   </w:rPr>
                 </w:pPr>
                 <w:r>
@@ -757,6 +724,7 @@
                     <w:bCs w:val="0"/>
                     <w:sz w:val="24"/>
                     <w:szCs w:val="24"/>
+                    <w:lang w:val="en-GB"/>
                   </w:rPr>
                   <w:lastRenderedPageBreak/>
                   <w:t>Candidate Signature:</w:t>
@@ -776,6 +744,7 @@
                     <w:rFonts w:eastAsiaTheme="majorEastAsia"/>
                     <w:sz w:val="24"/>
                     <w:szCs w:val="24"/>
+                    <w:lang w:val="en-GB"/>
                   </w:rPr>
                 </w:pPr>
                 <w:r>
@@ -784,13 +753,11 @@
                     <w:rFonts w:eastAsiaTheme="majorEastAsia"/>
                     <w:sz w:val="24"/>
                     <w:szCs w:val="24"/>
+                    <w:lang w:val="en-GB"/>
                   </w:rPr>
                   <w:t xml:space="preserve">               </w:t>
                 </w:r>
                 <w:r>
-                  <w:rPr>
-                    <w:noProof/>
-                  </w:rPr>
                   <w:drawing>
                     <wp:inline distT="0" distB="0" distL="0" distR="0" wp14:anchorId="13E8F6D4" wp14:editId="6B51F090">
                       <wp:extent cx="3340100" cy="1050290"/>
@@ -848,6 +815,7 @@
                     <w:bCs w:val="0"/>
                     <w:sz w:val="24"/>
                     <w:szCs w:val="24"/>
+                    <w:lang w:val="en-GB"/>
                   </w:rPr>
                 </w:pPr>
                 <w:r>
@@ -858,6 +826,7 @@
                     <w:bCs w:val="0"/>
                     <w:sz w:val="24"/>
                     <w:szCs w:val="24"/>
+                    <w:lang w:val="en-GB"/>
                   </w:rPr>
                   <w:t>Date:</w:t>
                 </w:r>
@@ -876,6 +845,7 @@
                     <w:rFonts w:eastAsiaTheme="majorEastAsia"/>
                     <w:sz w:val="24"/>
                     <w:szCs w:val="24"/>
+                    <w:lang w:val="en-GB"/>
                   </w:rPr>
                 </w:pPr>
                 <w:r>
@@ -884,6 +854,7 @@
                     <w:rFonts w:eastAsiaTheme="majorEastAsia"/>
                     <w:sz w:val="24"/>
                     <w:szCs w:val="24"/>
+                    <w:lang w:val="en-GB"/>
                   </w:rPr>
                   <w:t xml:space="preserve">               </w:t>
                 </w:r>
@@ -893,6 +864,7 @@
                     <w:rFonts w:eastAsiaTheme="majorEastAsia"/>
                     <w:sz w:val="24"/>
                     <w:szCs w:val="24"/>
+                    <w:lang w:val="en-GB"/>
                   </w:rPr>
                   <w:t>13/10/2026</w:t>
                 </w:r>
@@ -905,6 +877,7 @@
             <w:pStyle w:val="arial14ptbold"/>
             <w:rPr>
               <w:rStyle w:val="arial14ptboldChar"/>
+              <w:lang w:val="en-GB"/>
             </w:rPr>
           </w:pPr>
         </w:p>
@@ -968,7 +941,6 @@
         <w:rPr>
           <w:b/>
           <w:bCs/>
-          <w:noProof/>
         </w:rPr>
       </w:sdtEndPr>
       <w:sdtContent>
@@ -988,10 +960,9 @@
             </w:tabs>
             <w:rPr>
               <w:rFonts w:eastAsiaTheme="minorEastAsia"/>
-              <w:noProof/>
               <w:sz w:val="24"/>
               <w:szCs w:val="24"/>
-              <w:lang w:val="en-KE" w:eastAsia="en-KE"/>
+              <w:lang w:eastAsia="en-KE"/>
             </w:rPr>
           </w:pPr>
           <w:r>
@@ -1007,54 +978,46 @@
             <w:r>
               <w:rPr>
                 <w:rStyle w:val="Hyperlink"/>
-                <w:noProof/>
               </w:rPr>
               <w:t>BEAN BOUTIQUE WEBSITE PROJECT REPORT</w:t>
             </w:r>
             <w:r>
               <w:rPr>
-                <w:noProof/>
                 <w:webHidden/>
               </w:rPr>
               <w:tab/>
             </w:r>
             <w:r>
               <w:rPr>
-                <w:noProof/>
                 <w:webHidden/>
               </w:rPr>
               <w:fldChar w:fldCharType="begin"/>
             </w:r>
             <w:r>
               <w:rPr>
-                <w:noProof/>
                 <w:webHidden/>
               </w:rPr>
               <w:instrText xml:space="preserve"> PAGEREF _Toc242783099 \h </w:instrText>
             </w:r>
             <w:r>
               <w:rPr>
-                <w:noProof/>
-                <w:webHidden/>
-              </w:rPr>
-            </w:r>
-            <w:r>
-              <w:rPr>
-                <w:noProof/>
+                <w:webHidden/>
+              </w:rPr>
+            </w:r>
+            <w:r>
+              <w:rPr>
                 <w:webHidden/>
               </w:rPr>
               <w:fldChar w:fldCharType="separate"/>
             </w:r>
             <w:r>
               <w:rPr>
-                <w:noProof/>
                 <w:webHidden/>
               </w:rPr>
               <w:t>2</w:t>
             </w:r>
             <w:r>
               <w:rPr>
-                <w:noProof/>
                 <w:webHidden/>
               </w:rPr>
               <w:fldChar w:fldCharType="end"/>
@@ -1069,64 +1032,55 @@
             </w:tabs>
             <w:rPr>
               <w:rFonts w:eastAsiaTheme="minorEastAsia"/>
-              <w:noProof/>
               <w:sz w:val="24"/>
               <w:szCs w:val="24"/>
-              <w:lang w:val="en-KE" w:eastAsia="en-KE"/>
+              <w:lang w:eastAsia="en-KE"/>
             </w:rPr>
           </w:pPr>
           <w:hyperlink w:anchor="_Toc242783100" w:history="1">
             <w:r>
               <w:rPr>
                 <w:rStyle w:val="Hyperlink"/>
-                <w:noProof/>
               </w:rPr>
               <w:t>Test report</w:t>
             </w:r>
             <w:r>
               <w:rPr>
-                <w:noProof/>
                 <w:webHidden/>
               </w:rPr>
               <w:tab/>
             </w:r>
             <w:r>
               <w:rPr>
-                <w:noProof/>
                 <w:webHidden/>
               </w:rPr>
               <w:fldChar w:fldCharType="begin"/>
             </w:r>
             <w:r>
               <w:rPr>
-                <w:noProof/>
                 <w:webHidden/>
               </w:rPr>
               <w:instrText xml:space="preserve"> PAGEREF _Toc242783100 \h </w:instrText>
             </w:r>
             <w:r>
               <w:rPr>
-                <w:noProof/>
-                <w:webHidden/>
-              </w:rPr>
-            </w:r>
-            <w:r>
-              <w:rPr>
-                <w:noProof/>
+                <w:webHidden/>
+              </w:rPr>
+            </w:r>
+            <w:r>
+              <w:rPr>
                 <w:webHidden/>
               </w:rPr>
               <w:fldChar w:fldCharType="separate"/>
             </w:r>
             <w:r>
               <w:rPr>
-                <w:noProof/>
                 <w:webHidden/>
               </w:rPr>
               <w:t>3</w:t>
             </w:r>
             <w:r>
               <w:rPr>
-                <w:noProof/>
                 <w:webHidden/>
               </w:rPr>
               <w:fldChar w:fldCharType="end"/>
@@ -1142,81 +1096,70 @@
             </w:tabs>
             <w:rPr>
               <w:rFonts w:eastAsiaTheme="minorEastAsia"/>
-              <w:noProof/>
               <w:sz w:val="24"/>
               <w:szCs w:val="24"/>
-              <w:lang w:val="en-KE" w:eastAsia="en-KE"/>
+              <w:lang w:eastAsia="en-KE"/>
             </w:rPr>
           </w:pPr>
           <w:hyperlink w:anchor="_Toc242783101" w:history="1">
             <w:r>
               <w:rPr>
                 <w:rStyle w:val="Hyperlink"/>
-                <w:noProof/>
               </w:rPr>
               <w:t>i.</w:t>
             </w:r>
             <w:r>
               <w:rPr>
                 <w:rFonts w:eastAsiaTheme="minorEastAsia"/>
-                <w:noProof/>
                 <w:sz w:val="24"/>
                 <w:szCs w:val="24"/>
-                <w:lang w:val="en-KE" w:eastAsia="en-KE"/>
+                <w:lang w:eastAsia="en-KE"/>
               </w:rPr>
               <w:tab/>
             </w:r>
             <w:r>
               <w:rPr>
                 <w:rStyle w:val="Hyperlink"/>
-                <w:noProof/>
               </w:rPr>
               <w:t>Introduction</w:t>
             </w:r>
             <w:r>
               <w:rPr>
-                <w:noProof/>
                 <w:webHidden/>
               </w:rPr>
               <w:tab/>
             </w:r>
             <w:r>
               <w:rPr>
-                <w:noProof/>
                 <w:webHidden/>
               </w:rPr>
               <w:fldChar w:fldCharType="begin"/>
             </w:r>
             <w:r>
               <w:rPr>
-                <w:noProof/>
                 <w:webHidden/>
               </w:rPr>
               <w:instrText xml:space="preserve"> PAGEREF _Toc242783101 \h </w:instrText>
             </w:r>
             <w:r>
               <w:rPr>
-                <w:noProof/>
-                <w:webHidden/>
-              </w:rPr>
-            </w:r>
-            <w:r>
-              <w:rPr>
-                <w:noProof/>
+                <w:webHidden/>
+              </w:rPr>
+            </w:r>
+            <w:r>
+              <w:rPr>
                 <w:webHidden/>
               </w:rPr>
               <w:fldChar w:fldCharType="separate"/>
             </w:r>
             <w:r>
               <w:rPr>
-                <w:noProof/>
                 <w:webHidden/>
               </w:rPr>
               <w:t>3</w:t>
             </w:r>
             <w:r>
               <w:rPr>
-                <w:noProof/>
                 <w:webHidden/>
               </w:rPr>
               <w:fldChar w:fldCharType="end"/>
@@ -1232,81 +1175,70 @@
             </w:tabs>
             <w:rPr>
               <w:rFonts w:eastAsiaTheme="minorEastAsia"/>
-              <w:noProof/>
               <w:sz w:val="24"/>
               <w:szCs w:val="24"/>
-              <w:lang w:val="en-KE" w:eastAsia="en-KE"/>
+              <w:lang w:eastAsia="en-KE"/>
             </w:rPr>
           </w:pPr>
           <w:hyperlink w:anchor="_Toc242783102" w:history="1">
             <w:r>
               <w:rPr>
                 <w:rStyle w:val="Hyperlink"/>
-                <w:noProof/>
               </w:rPr>
               <w:t>ii.</w:t>
             </w:r>
             <w:r>
               <w:rPr>
                 <w:rFonts w:eastAsiaTheme="minorEastAsia"/>
-                <w:noProof/>
                 <w:sz w:val="24"/>
                 <w:szCs w:val="24"/>
-                <w:lang w:val="en-KE" w:eastAsia="en-KE"/>
+                <w:lang w:eastAsia="en-KE"/>
               </w:rPr>
               <w:tab/>
             </w:r>
             <w:r>
               <w:rPr>
                 <w:rStyle w:val="Hyperlink"/>
-                <w:noProof/>
               </w:rPr>
               <w:t>W3C Validation</w:t>
             </w:r>
             <w:r>
               <w:rPr>
-                <w:noProof/>
                 <w:webHidden/>
               </w:rPr>
               <w:tab/>
             </w:r>
             <w:r>
               <w:rPr>
-                <w:noProof/>
                 <w:webHidden/>
               </w:rPr>
               <w:fldChar w:fldCharType="begin"/>
             </w:r>
             <w:r>
               <w:rPr>
-                <w:noProof/>
                 <w:webHidden/>
               </w:rPr>
               <w:instrText xml:space="preserve"> PAGEREF _Toc242783102 \h </w:instrText>
             </w:r>
             <w:r>
               <w:rPr>
-                <w:noProof/>
-                <w:webHidden/>
-              </w:rPr>
-            </w:r>
-            <w:r>
-              <w:rPr>
-                <w:noProof/>
+                <w:webHidden/>
+              </w:rPr>
+            </w:r>
+            <w:r>
+              <w:rPr>
                 <w:webHidden/>
               </w:rPr>
               <w:fldChar w:fldCharType="separate"/>
             </w:r>
             <w:r>
               <w:rPr>
-                <w:noProof/>
                 <w:webHidden/>
               </w:rPr>
               <w:t>3</w:t>
             </w:r>
             <w:r>
               <w:rPr>
-                <w:noProof/>
                 <w:webHidden/>
               </w:rPr>
               <w:fldChar w:fldCharType="end"/>
@@ -1322,81 +1254,70 @@
             </w:tabs>
             <w:rPr>
               <w:rFonts w:eastAsiaTheme="minorEastAsia"/>
-              <w:noProof/>
               <w:sz w:val="24"/>
               <w:szCs w:val="24"/>
-              <w:lang w:val="en-KE" w:eastAsia="en-KE"/>
+              <w:lang w:eastAsia="en-KE"/>
             </w:rPr>
           </w:pPr>
           <w:hyperlink w:anchor="_Toc242783103" w:history="1">
             <w:r>
               <w:rPr>
                 <w:rStyle w:val="Hyperlink"/>
-                <w:noProof/>
               </w:rPr>
               <w:t>iii.</w:t>
             </w:r>
             <w:r>
               <w:rPr>
                 <w:rFonts w:eastAsiaTheme="minorEastAsia"/>
-                <w:noProof/>
                 <w:sz w:val="24"/>
                 <w:szCs w:val="24"/>
-                <w:lang w:val="en-KE" w:eastAsia="en-KE"/>
+                <w:lang w:eastAsia="en-KE"/>
               </w:rPr>
               <w:tab/>
             </w:r>
             <w:r>
               <w:rPr>
                 <w:rStyle w:val="Hyperlink"/>
-                <w:noProof/>
               </w:rPr>
               <w:t>Cross-Browser Testing</w:t>
             </w:r>
             <w:r>
               <w:rPr>
-                <w:noProof/>
                 <w:webHidden/>
               </w:rPr>
               <w:tab/>
             </w:r>
             <w:r>
               <w:rPr>
-                <w:noProof/>
                 <w:webHidden/>
               </w:rPr>
               <w:fldChar w:fldCharType="begin"/>
             </w:r>
             <w:r>
               <w:rPr>
-                <w:noProof/>
                 <w:webHidden/>
               </w:rPr>
               <w:instrText xml:space="preserve"> PAGEREF _Toc242783103 \h </w:instrText>
             </w:r>
             <w:r>
               <w:rPr>
-                <w:noProof/>
-                <w:webHidden/>
-              </w:rPr>
-            </w:r>
-            <w:r>
-              <w:rPr>
-                <w:noProof/>
+                <w:webHidden/>
+              </w:rPr>
+            </w:r>
+            <w:r>
+              <w:rPr>
                 <w:webHidden/>
               </w:rPr>
               <w:fldChar w:fldCharType="separate"/>
             </w:r>
             <w:r>
               <w:rPr>
-                <w:noProof/>
                 <w:webHidden/>
               </w:rPr>
               <w:t>3</w:t>
             </w:r>
             <w:r>
               <w:rPr>
-                <w:noProof/>
                 <w:webHidden/>
               </w:rPr>
               <w:fldChar w:fldCharType="end"/>
@@ -1412,81 +1333,70 @@
             </w:tabs>
             <w:rPr>
               <w:rFonts w:eastAsiaTheme="minorEastAsia"/>
-              <w:noProof/>
               <w:sz w:val="24"/>
               <w:szCs w:val="24"/>
-              <w:lang w:val="en-KE" w:eastAsia="en-KE"/>
+              <w:lang w:eastAsia="en-KE"/>
             </w:rPr>
           </w:pPr>
           <w:hyperlink w:anchor="_Toc242783104" w:history="1">
             <w:r>
               <w:rPr>
                 <w:rStyle w:val="Hyperlink"/>
-                <w:noProof/>
               </w:rPr>
               <w:t>iv.</w:t>
             </w:r>
             <w:r>
               <w:rPr>
                 <w:rFonts w:eastAsiaTheme="minorEastAsia"/>
-                <w:noProof/>
                 <w:sz w:val="24"/>
                 <w:szCs w:val="24"/>
-                <w:lang w:val="en-KE" w:eastAsia="en-KE"/>
+                <w:lang w:eastAsia="en-KE"/>
               </w:rPr>
               <w:tab/>
             </w:r>
             <w:r>
               <w:rPr>
                 <w:rStyle w:val="Hyperlink"/>
-                <w:noProof/>
               </w:rPr>
               <w:t>Mobile/Responsive Testing</w:t>
             </w:r>
             <w:r>
               <w:rPr>
-                <w:noProof/>
                 <w:webHidden/>
               </w:rPr>
               <w:tab/>
             </w:r>
             <w:r>
               <w:rPr>
-                <w:noProof/>
                 <w:webHidden/>
               </w:rPr>
               <w:fldChar w:fldCharType="begin"/>
             </w:r>
             <w:r>
               <w:rPr>
-                <w:noProof/>
                 <w:webHidden/>
               </w:rPr>
               <w:instrText xml:space="preserve"> PAGEREF _Toc242783104 \h </w:instrText>
             </w:r>
             <w:r>
               <w:rPr>
-                <w:noProof/>
-                <w:webHidden/>
-              </w:rPr>
-            </w:r>
-            <w:r>
-              <w:rPr>
-                <w:noProof/>
+                <w:webHidden/>
+              </w:rPr>
+            </w:r>
+            <w:r>
+              <w:rPr>
                 <w:webHidden/>
               </w:rPr>
               <w:fldChar w:fldCharType="separate"/>
             </w:r>
             <w:r>
               <w:rPr>
-                <w:noProof/>
                 <w:webHidden/>
               </w:rPr>
               <w:t>3</w:t>
             </w:r>
             <w:r>
               <w:rPr>
-                <w:noProof/>
                 <w:webHidden/>
               </w:rPr>
               <w:fldChar w:fldCharType="end"/>
@@ -1502,81 +1412,70 @@
             </w:tabs>
             <w:rPr>
               <w:rFonts w:eastAsiaTheme="minorEastAsia"/>
-              <w:noProof/>
               <w:sz w:val="24"/>
               <w:szCs w:val="24"/>
-              <w:lang w:val="en-KE" w:eastAsia="en-KE"/>
+              <w:lang w:eastAsia="en-KE"/>
             </w:rPr>
           </w:pPr>
           <w:hyperlink w:anchor="_Toc242783105" w:history="1">
             <w:r>
               <w:rPr>
                 <w:rStyle w:val="Hyperlink"/>
-                <w:noProof/>
               </w:rPr>
               <w:t>v.</w:t>
             </w:r>
             <w:r>
               <w:rPr>
                 <w:rFonts w:eastAsiaTheme="minorEastAsia"/>
-                <w:noProof/>
                 <w:sz w:val="24"/>
                 <w:szCs w:val="24"/>
-                <w:lang w:val="en-KE" w:eastAsia="en-KE"/>
+                <w:lang w:eastAsia="en-KE"/>
               </w:rPr>
               <w:tab/>
             </w:r>
             <w:r>
               <w:rPr>
                 <w:rStyle w:val="Hyperlink"/>
-                <w:noProof/>
               </w:rPr>
               <w:t>Accessibility Testing</w:t>
             </w:r>
             <w:r>
               <w:rPr>
-                <w:noProof/>
                 <w:webHidden/>
               </w:rPr>
               <w:tab/>
             </w:r>
             <w:r>
               <w:rPr>
-                <w:noProof/>
                 <w:webHidden/>
               </w:rPr>
               <w:fldChar w:fldCharType="begin"/>
             </w:r>
             <w:r>
               <w:rPr>
-                <w:noProof/>
                 <w:webHidden/>
               </w:rPr>
               <w:instrText xml:space="preserve"> PAGEREF _Toc242783105 \h </w:instrText>
             </w:r>
             <w:r>
               <w:rPr>
-                <w:noProof/>
-                <w:webHidden/>
-              </w:rPr>
-            </w:r>
-            <w:r>
-              <w:rPr>
-                <w:noProof/>
+                <w:webHidden/>
+              </w:rPr>
+            </w:r>
+            <w:r>
+              <w:rPr>
                 <w:webHidden/>
               </w:rPr>
               <w:fldChar w:fldCharType="separate"/>
             </w:r>
             <w:r>
               <w:rPr>
-                <w:noProof/>
                 <w:webHidden/>
               </w:rPr>
               <w:t>3</w:t>
             </w:r>
             <w:r>
               <w:rPr>
-                <w:noProof/>
                 <w:webHidden/>
               </w:rPr>
               <w:fldChar w:fldCharType="end"/>
@@ -1591,64 +1490,55 @@
             </w:tabs>
             <w:rPr>
               <w:rFonts w:eastAsiaTheme="minorEastAsia"/>
-              <w:noProof/>
               <w:sz w:val="24"/>
               <w:szCs w:val="24"/>
-              <w:lang w:val="en-KE" w:eastAsia="en-KE"/>
+              <w:lang w:eastAsia="en-KE"/>
             </w:rPr>
           </w:pPr>
           <w:hyperlink w:anchor="_Toc242783106" w:history="1">
             <w:r>
               <w:rPr>
                 <w:rStyle w:val="Hyperlink"/>
-                <w:noProof/>
               </w:rPr>
               <w:t>Role of W3C</w:t>
             </w:r>
             <w:r>
               <w:rPr>
-                <w:noProof/>
                 <w:webHidden/>
               </w:rPr>
               <w:tab/>
             </w:r>
             <w:r>
               <w:rPr>
-                <w:noProof/>
                 <w:webHidden/>
               </w:rPr>
               <w:fldChar w:fldCharType="begin"/>
             </w:r>
             <w:r>
               <w:rPr>
-                <w:noProof/>
                 <w:webHidden/>
               </w:rPr>
               <w:instrText xml:space="preserve"> PAGEREF _Toc242783106 \h </w:instrText>
             </w:r>
             <w:r>
               <w:rPr>
-                <w:noProof/>
-                <w:webHidden/>
-              </w:rPr>
-            </w:r>
-            <w:r>
-              <w:rPr>
-                <w:noProof/>
+                <w:webHidden/>
+              </w:rPr>
+            </w:r>
+            <w:r>
+              <w:rPr>
                 <w:webHidden/>
               </w:rPr>
               <w:fldChar w:fldCharType="separate"/>
             </w:r>
             <w:r>
               <w:rPr>
-                <w:noProof/>
                 <w:webHidden/>
               </w:rPr>
               <w:t>4</w:t>
             </w:r>
             <w:r>
               <w:rPr>
-                <w:noProof/>
                 <w:webHidden/>
               </w:rPr>
               <w:fldChar w:fldCharType="end"/>
@@ -1663,64 +1553,55 @@
             </w:tabs>
             <w:rPr>
               <w:rFonts w:eastAsiaTheme="minorEastAsia"/>
-              <w:noProof/>
               <w:sz w:val="24"/>
               <w:szCs w:val="24"/>
-              <w:lang w:val="en-KE" w:eastAsia="en-KE"/>
+              <w:lang w:eastAsia="en-KE"/>
             </w:rPr>
           </w:pPr>
           <w:hyperlink w:anchor="_Toc242783107" w:history="1">
             <w:r>
               <w:rPr>
                 <w:rStyle w:val="Hyperlink"/>
-                <w:noProof/>
               </w:rPr>
               <w:t>Critical Evaluation</w:t>
             </w:r>
             <w:r>
               <w:rPr>
-                <w:noProof/>
                 <w:webHidden/>
               </w:rPr>
               <w:tab/>
             </w:r>
             <w:r>
               <w:rPr>
-                <w:noProof/>
                 <w:webHidden/>
               </w:rPr>
               <w:fldChar w:fldCharType="begin"/>
             </w:r>
             <w:r>
               <w:rPr>
-                <w:noProof/>
                 <w:webHidden/>
               </w:rPr>
               <w:instrText xml:space="preserve"> PAGEREF _Toc242783107 \h </w:instrText>
             </w:r>
             <w:r>
               <w:rPr>
-                <w:noProof/>
-                <w:webHidden/>
-              </w:rPr>
-            </w:r>
-            <w:r>
-              <w:rPr>
-                <w:noProof/>
+                <w:webHidden/>
+              </w:rPr>
+            </w:r>
+            <w:r>
+              <w:rPr>
                 <w:webHidden/>
               </w:rPr>
               <w:fldChar w:fldCharType="separate"/>
             </w:r>
             <w:r>
               <w:rPr>
-                <w:noProof/>
                 <w:webHidden/>
               </w:rPr>
               <w:t>4</w:t>
             </w:r>
             <w:r>
               <w:rPr>
-                <w:noProof/>
                 <w:webHidden/>
               </w:rPr>
               <w:fldChar w:fldCharType="end"/>
@@ -1736,81 +1617,70 @@
             </w:tabs>
             <w:rPr>
               <w:rFonts w:eastAsiaTheme="minorEastAsia"/>
-              <w:noProof/>
               <w:sz w:val="24"/>
               <w:szCs w:val="24"/>
-              <w:lang w:val="en-KE" w:eastAsia="en-KE"/>
+              <w:lang w:eastAsia="en-KE"/>
             </w:rPr>
           </w:pPr>
           <w:hyperlink w:anchor="_Toc242783108" w:history="1">
             <w:r>
               <w:rPr>
                 <w:rStyle w:val="Hyperlink"/>
-                <w:noProof/>
               </w:rPr>
               <w:t>a)</w:t>
             </w:r>
             <w:r>
               <w:rPr>
                 <w:rFonts w:eastAsiaTheme="minorEastAsia"/>
-                <w:noProof/>
                 <w:sz w:val="24"/>
                 <w:szCs w:val="24"/>
-                <w:lang w:val="en-KE" w:eastAsia="en-KE"/>
+                <w:lang w:eastAsia="en-KE"/>
               </w:rPr>
               <w:tab/>
             </w:r>
             <w:r>
               <w:rPr>
                 <w:rStyle w:val="Hyperlink"/>
-                <w:noProof/>
               </w:rPr>
               <w:t>How back-end can be used to better the website and how back-end differs from front-end</w:t>
             </w:r>
             <w:r>
               <w:rPr>
-                <w:noProof/>
                 <w:webHidden/>
               </w:rPr>
               <w:tab/>
             </w:r>
             <w:r>
               <w:rPr>
-                <w:noProof/>
                 <w:webHidden/>
               </w:rPr>
               <w:fldChar w:fldCharType="begin"/>
             </w:r>
             <w:r>
               <w:rPr>
-                <w:noProof/>
                 <w:webHidden/>
               </w:rPr>
               <w:instrText xml:space="preserve"> PAGEREF _Toc242783108 \h </w:instrText>
             </w:r>
             <w:r>
               <w:rPr>
-                <w:noProof/>
-                <w:webHidden/>
-              </w:rPr>
-            </w:r>
-            <w:r>
-              <w:rPr>
-                <w:noProof/>
+                <w:webHidden/>
+              </w:rPr>
+            </w:r>
+            <w:r>
+              <w:rPr>
                 <w:webHidden/>
               </w:rPr>
               <w:fldChar w:fldCharType="separate"/>
             </w:r>
             <w:r>
               <w:rPr>
-                <w:noProof/>
                 <w:webHidden/>
               </w:rPr>
               <w:t>4</w:t>
             </w:r>
             <w:r>
               <w:rPr>
-                <w:noProof/>
                 <w:webHidden/>
               </w:rPr>
               <w:fldChar w:fldCharType="end"/>
@@ -1826,81 +1696,70 @@
             </w:tabs>
             <w:rPr>
               <w:rFonts w:eastAsiaTheme="minorEastAsia"/>
-              <w:noProof/>
               <w:sz w:val="24"/>
               <w:szCs w:val="24"/>
-              <w:lang w:val="en-KE" w:eastAsia="en-KE"/>
+              <w:lang w:eastAsia="en-KE"/>
             </w:rPr>
           </w:pPr>
           <w:hyperlink w:anchor="_Toc242783109" w:history="1">
             <w:r>
               <w:rPr>
                 <w:rStyle w:val="Hyperlink"/>
-                <w:noProof/>
               </w:rPr>
               <w:t>b)</w:t>
             </w:r>
             <w:r>
               <w:rPr>
                 <w:rFonts w:eastAsiaTheme="minorEastAsia"/>
-                <w:noProof/>
                 <w:sz w:val="24"/>
                 <w:szCs w:val="24"/>
-                <w:lang w:val="en-KE" w:eastAsia="en-KE"/>
+                <w:lang w:eastAsia="en-KE"/>
               </w:rPr>
               <w:tab/>
             </w:r>
             <w:r>
               <w:rPr>
                 <w:rStyle w:val="Hyperlink"/>
-                <w:noProof/>
               </w:rPr>
               <w:t>What plugins have been used</w:t>
             </w:r>
             <w:r>
               <w:rPr>
-                <w:noProof/>
                 <w:webHidden/>
               </w:rPr>
               <w:tab/>
             </w:r>
             <w:r>
               <w:rPr>
-                <w:noProof/>
                 <w:webHidden/>
               </w:rPr>
               <w:fldChar w:fldCharType="begin"/>
             </w:r>
             <w:r>
               <w:rPr>
-                <w:noProof/>
                 <w:webHidden/>
               </w:rPr>
               <w:instrText xml:space="preserve"> PAGEREF _Toc242783109 \h </w:instrText>
             </w:r>
             <w:r>
               <w:rPr>
-                <w:noProof/>
-                <w:webHidden/>
-              </w:rPr>
-            </w:r>
-            <w:r>
-              <w:rPr>
-                <w:noProof/>
+                <w:webHidden/>
+              </w:rPr>
+            </w:r>
+            <w:r>
+              <w:rPr>
                 <w:webHidden/>
               </w:rPr>
               <w:fldChar w:fldCharType="separate"/>
             </w:r>
             <w:r>
               <w:rPr>
-                <w:noProof/>
                 <w:webHidden/>
               </w:rPr>
               <w:t>4</w:t>
             </w:r>
             <w:r>
               <w:rPr>
-                <w:noProof/>
                 <w:webHidden/>
               </w:rPr>
               <w:fldChar w:fldCharType="end"/>
@@ -1912,7 +1771,6 @@
             <w:rPr>
               <w:b/>
               <w:bCs/>
-              <w:noProof/>
             </w:rPr>
             <w:fldChar w:fldCharType="end"/>
           </w:r>
@@ -2054,7 +1912,19 @@
     </w:p>
     <w:p>
       <w:r>
-        <w:t>For keyboard only users, The modal close button could be reached using tab and clicked using Enter, The carousel could be navigated using the arrow buttons and the rest of the website could be used via tab for next button, shift tab for previous button and enter to click a button.</w:t>
+        <w:t xml:space="preserve">For keyboard only users, </w:t>
+      </w:r>
+      <w:r>
+        <w:t>the</w:t>
+      </w:r>
+      <w:r>
+        <w:t xml:space="preserve"> modal close button could be reached using tab and clicked using Enter, </w:t>
+      </w:r>
+      <w:r>
+        <w:t>the</w:t>
+      </w:r>
+      <w:r>
+        <w:t xml:space="preserve"> carousel could be navigated using the arrow buttons and the rest of the website could be used via tab for next button, shift tab for previous button and enter to click a button.</w:t>
       </w:r>
     </w:p>
     <w:p>
@@ -2076,7 +1946,13 @@
         <w:t>The W3C sets international standards for the web ensuring that HTML, CSS and accessibility guidelines are consistent across browsers and devices</w:t>
       </w:r>
       <w:r>
-        <w:t>. Performing validations using W3C standards ensures that cross-browser and cross-device  reliability is up to global standards and that the website is future-proof.</w:t>
+        <w:t>. Performing validations using W3C standards ensures that cross-browser and cross-</w:t>
+      </w:r>
+      <w:r>
+        <w:t>device reliability</w:t>
+      </w:r>
+      <w:r>
+        <w:t xml:space="preserve"> is up to global standards and that the website is future-proof.</w:t>
       </w:r>
     </w:p>
     <w:p>
@@ -2135,7 +2011,13 @@
         <w:t xml:space="preserve"> which is the user facing part of the program</w:t>
       </w:r>
       <w:r>
-        <w:t xml:space="preserve"> with some javascript for carousel</w:t>
+        <w:t xml:space="preserve"> with some </w:t>
+      </w:r>
+      <w:r>
+        <w:t>JavaScript</w:t>
+      </w:r>
+      <w:r>
+        <w:t xml:space="preserve"> for carousel</w:t>
       </w:r>
       <w:r>
         <w:t>,</w:t>
@@ -2150,13 +2032,37 @@
         <w:t>d to cart a</w:t>
       </w:r>
       <w:r>
-        <w:t>nd other functionalities. Future iterations of the site could benefit from having a back end as it can allow for other functions. A project catalog can be created in a</w:t>
+        <w:t xml:space="preserve">nd other functionalities. Future iterations of the site could benefit from having a back end as it can allow for other functions. A project </w:t>
+      </w:r>
+      <w:r>
+        <w:t>catalogue</w:t>
+      </w:r>
+      <w:r>
+        <w:t xml:space="preserve"> can be created in a</w:t>
       </w:r>
       <w:r>
         <w:t>n SQL</w:t>
       </w:r>
       <w:r>
-        <w:t xml:space="preserve"> database, from which the front end would request data via an API instead of having the catalog hard coded into the HTML. The benefits of such a system would be that the shop owner can edit their catalog without needing to edit the code. Another benefit is allowing for user accounts and authentication. This allows for a user to save shipping addresses, order history and subscription services. The shopping cart can also be improved by a backend especially if coupled with the user accounts feature. The current cart stores items in the local browser cache which can be deleted and does not go to other browsers or devices, If there is a back-end, the cart can be linked to a user’s account thereby allowing them to access the cart items on any browser or device in which they log into their account</w:t>
+        <w:t xml:space="preserve"> database, from which the front end would request data via an API instead of having the </w:t>
+      </w:r>
+      <w:r>
+        <w:t>catalogue</w:t>
+      </w:r>
+      <w:r>
+        <w:t xml:space="preserve"> hard coded into the HTML. The benefits of such a system would be that the shop owner can edit their </w:t>
+      </w:r>
+      <w:r>
+        <w:t>catalogue</w:t>
+      </w:r>
+      <w:r>
+        <w:t xml:space="preserve"> without needing to edit the code. Another benefit is allowing for user accounts and authentication. This allows for a user to save shipping addresses, order history and subscription services. The shopping cart can also be improved by a backend especially if coupled with the user accounts feature. The current cart stores items in the local browser cache which can be deleted and does not go to other browsers or devices, </w:t>
+      </w:r>
+      <w:r>
+        <w:t>if</w:t>
+      </w:r>
+      <w:r>
+        <w:t xml:space="preserve"> there is a back-end, the cart can be linked to a user’s account thereby allowing them to access the cart items on any browser or device in which they log into their account</w:t>
       </w:r>
       <w:r>
         <w:t>. A backend system will also be crucial for payment processing which the current site does not handle.</w:t>
@@ -2178,7 +2084,13 @@
     </w:p>
     <w:p>
       <w:r>
-        <w:t>The main plugins used were Google Maps Embed, Font Awesome, and Bootstrap components. The google Maps Embed was chosen as it caters for the brief’s requirement to have an interactive map to locate the shop which is also the venue for all events unless stated otherwise. Users can zoom, pan, or be taken to the google maps website/app to get directions. Next is font Awesome which allows us to use their vast catalog of icons such as star ratings, the shopping cart icon, social media icons in the footer, and others. It is one of the most widely used icon libraries therefore is reliable</w:t>
+        <w:t xml:space="preserve">The main plugins used were Google Maps Embed, Font Awesome, and Bootstrap components. The google Maps Embed was chosen as it caters for the brief’s requirement to have an interactive map to locate the shop which is also the venue for all events unless stated otherwise. Users can zoom, pan, or be taken to the google maps website/app to get directions. Next is font Awesome which allows us to use their vast </w:t>
+      </w:r>
+      <w:r>
+        <w:t>catalogue</w:t>
+      </w:r>
+      <w:r>
+        <w:t xml:space="preserve"> of icons such as star ratings, the shopping cart icon, social media icons in the footer, and others. It is one of the most widely used icon libraries therefore is reliable</w:t>
       </w:r>
       <w:r>
         <w:t xml:space="preserve">, the icons’ properties can be edited in CSS, and it allows for a clean looking website. Last but not least, </w:t>
@@ -2187,7 +2099,13 @@
         <w:t>w</w:t>
       </w:r>
       <w:r>
-        <w:t>e have used bootstrap  components for the navbar, modal, and carousel which greatly saves on development time and allows for more seamless cross-browser and cross-device compatibility.</w:t>
+        <w:t xml:space="preserve">e have used </w:t>
+      </w:r>
+      <w:r>
+        <w:t>bootstrap components</w:t>
+      </w:r>
+      <w:r>
+        <w:t xml:space="preserve"> for the navbar, modal, and carousel which greatly saves on development time and allows for more seamless cross-browser and cross-device compatibility.</w:t>
       </w:r>
     </w:p>
     <w:p>
@@ -2233,7 +2151,19 @@
     </w:p>
     <w:p>
       <w:r>
-        <w:t>A front end framework such as Bootstrap or react is a prebuilt collection of code and tools that provide structure for building UIs or user interfaces. There are Component libraries such as bootstrap and Javascript frameworks like react. Frameworks provide reusable components, layout systems, responsive breakpoints, and many other features that can greatly improve a frontend developer’s workflow. These frameworks offer many advantages for a web developer in areas of speed, where prebuilt carousel allow for less code to be written, consistency, as it enforces a unified look across pages, responsiveness because of breakpoints, and many others. Some downsides of frameworks include that they add file size, overriding styles may be harder than writing CSS from scratch, and once a framework is heavily used in a website, switching may prove to be difficult and costly.</w:t>
+        <w:t xml:space="preserve">A </w:t>
+      </w:r>
+      <w:r>
+        <w:t>front-end</w:t>
+      </w:r>
+      <w:r>
+        <w:t xml:space="preserve"> framework such as Bootstrap or react is a prebuilt collection of code and tools that provide structure for building UIs or user interfaces. There are Component libraries such as bootstrap and </w:t>
+      </w:r>
+      <w:r>
+        <w:t>JavaScript</w:t>
+      </w:r>
+      <w:r>
+        <w:t xml:space="preserve"> frameworks like react. Frameworks provide reusable components, layout systems, responsive breakpoints, and many other features that can greatly improve a frontend developer’s workflow. These frameworks offer many advantages for a web developer in areas of speed, where prebuilt carousel allow for less code to be written, consistency, as it enforces a unified look across pages, responsiveness because of breakpoints, and many others. Some downsides of frameworks include that they add file size, overriding styles may be harder than writing CSS from scratch, and once a framework is heavily used in a website, switching may prove to be difficult and costly.</w:t>
       </w:r>
       <w:r>
         <w:t xml:space="preserve"> Bootstrap was the framework of choice for bean boutique as it reduced time taken on making the navbar, carousel, modal and other components of the site.</w:t>
@@ -2256,7 +2186,19 @@
         <w:t xml:space="preserve">Some unique selling points include a cohesive visual identity that is consistent across the pages and offers a warm, boutique feel to the website, also the interactive features such as the roast filter, working cart, modal, and many more. </w:t>
       </w:r>
       <w:r>
-        <w:t>The site’s mobile responsiveness is also a unique selling point as it allows the website to be used from a smartwatch to a television and anything in- between. The greatest value technology would be Javascript as without it the filters, modal and cart would not work. The main improvements include adding a backend which will allow for many new features to be added but most importantly M-pesa integration as the current iteration does not support any method of payment.</w:t>
+        <w:t xml:space="preserve">The site’s mobile responsiveness is also a unique selling point as it allows the website to be used from a smartwatch to a television and anything in- between. The greatest value technology would be </w:t>
+      </w:r>
+      <w:r>
+        <w:t>JavaScript</w:t>
+      </w:r>
+      <w:r>
+        <w:t xml:space="preserve"> as without it the filters, modal and cart would not work. The main improvements include adding a backend which will allow for many new features to be added but most importantly M-</w:t>
+      </w:r>
+      <w:r>
+        <w:t>Pesa</w:t>
+      </w:r>
+      <w:r>
+        <w:t xml:space="preserve"> integration as the current iteration does not support any method of payment.</w:t>
       </w:r>
     </w:p>
     <w:p/>
@@ -2346,7 +2288,6 @@
     </w:pPr>
     <w:r>
       <w:rPr>
-        <w:noProof/>
         <w:color w:val="FFFFFF" w:themeColor="background1"/>
         <w:sz w:val="56"/>
         <w:szCs w:val="44"/>
@@ -3123,6 +3064,9 @@
   <w:style w:type="paragraph" w:default="1" w:styleId="Normal">
     <w:name w:val="Normal"/>
     <w:qFormat/>
+    <w:rPr>
+      <w:lang w:val="en-GB"/>
+    </w:rPr>
   </w:style>
   <w:style w:type="paragraph" w:styleId="Heading1">
     <w:name w:val="heading 1"/>
@@ -3329,6 +3273,7 @@
   <w:style w:type="character" w:default="1" w:styleId="DefaultParagraphFont">
     <w:name w:val="Default Paragraph Font"/>
     <w:uiPriority w:val="1"/>
+    <w:semiHidden/>
     <w:unhideWhenUsed/>
   </w:style>
   <w:style w:type="table" w:default="1" w:styleId="TableNormal">

</xml_diff>